<commit_message>
Fix bug "Sota/le" in "Jos/lo" + draft V3
</commit_message>
<xml_diff>
--- a/assets/Terre-de-Barons-TB7-Eagle-Crest-Lyrics-v2.docx
+++ b/assets/Terre-de-Barons-TB7-Eagle-Crest-Lyrics-v2.docx
@@ -652,7 +652,31 @@
                 <w:bCs/>
                 <w:lang w:val="oc-FR"/>
               </w:rPr>
-              <w:t>Sota la crotz, le vòt es prestat!</w:t>
+              <w:t>Jos</w:t>
+            </w:r>
+            <w:r>
+              <w:rPr>
+                <w:b/>
+                <w:bCs/>
+                <w:lang w:val="oc-FR"/>
+              </w:rPr>
+              <w:t xml:space="preserve"> la crotz, l</w:t>
+            </w:r>
+            <w:r>
+              <w:rPr>
+                <w:b/>
+                <w:bCs/>
+                <w:lang w:val="oc-FR"/>
+              </w:rPr>
+              <w:t>o</w:t>
+            </w:r>
+            <w:r>
+              <w:rPr>
+                <w:b/>
+                <w:bCs/>
+                <w:lang w:val="oc-FR"/>
+              </w:rPr>
+              <w:t xml:space="preserve"> vòt es prestat!</w:t>
             </w:r>
           </w:p>
         </w:tc>
@@ -1446,7 +1470,31 @@
                 <w:bCs/>
                 <w:lang w:val="oc-FR"/>
               </w:rPr>
-              <w:t>Sota la crotz, le vòt es prestat!</w:t>
+              <w:t>Jos</w:t>
+            </w:r>
+            <w:r>
+              <w:rPr>
+                <w:b/>
+                <w:bCs/>
+                <w:lang w:val="oc-FR"/>
+              </w:rPr>
+              <w:t xml:space="preserve"> la crotz, l</w:t>
+            </w:r>
+            <w:r>
+              <w:rPr>
+                <w:b/>
+                <w:bCs/>
+                <w:lang w:val="oc-FR"/>
+              </w:rPr>
+              <w:t>o</w:t>
+            </w:r>
+            <w:r>
+              <w:rPr>
+                <w:b/>
+                <w:bCs/>
+                <w:lang w:val="oc-FR"/>
+              </w:rPr>
+              <w:t xml:space="preserve"> vòt es prestat!</w:t>
             </w:r>
           </w:p>
         </w:tc>

</xml_diff>